<commit_message>
feat: Add scripts to expand and clean story files
Co-authored-by: jpearleverett <jpearleverett@gmail.com>
</commit_message>
<xml_diff>
--- a/story/The_Midnight_Confessor_Batch10.docx
+++ b/story/The_Midnight_Confessor_Batch10.docx
@@ -316,12 +316,7 @@
         </w:rPr>
       </w:pPr>
       <w:r>
-        <w:rPr>
-          <w:i w:val="1"/>
-          <w:iCs w:val="1"/>
-          <w:rtl w:val="0"/>
-        </w:rPr>
-        <w:t xml:space="preserve">The system won't let James Sullivan walk Jack. His original file contains evidence that exposes the Overseer. They will burn the file before they release him. Meet me at the Lamplight Gallery. I have the untainted copy. —E.C.</w:t>
+        <w:t>The system won't let James Sullivan walk Jack. His original file contains evidence that exposes the Overseer. They will burn the file before they release him. Meet me at the Lamplight Gallery. I have the untainted copy.. E.C.</w:t>
       </w:r>
     </w:p>
     <w:p>
@@ -338,10 +333,7 @@
         <w:rPr/>
       </w:pPr>
       <w:r>
-        <w:rPr>
-          <w:rtl w:val="0"/>
-        </w:rPr>
-        <w:t xml:space="preserve">I looked at Sarah. We were blocked. Victoria had the key and the clock was ticking against James Sullivan's very existence.</w:t>
+        <w:t>I studied Sarah. We were blocked. Victoria had the key and the clock was ticking against James Sullivan's very existence.</w:t>
       </w:r>
     </w:p>
     <w:p>
@@ -661,6 +653,36 @@
           <w:rtl w:val="0"/>
         </w:rPr>
         <w:t xml:space="preserve">I had to convince her. I had to choose a final desperate plea. A way to cut through her professional armor and force her to act on instinct. Whether moral or financial.</w:t>
+      </w:r>
+    </w:p>
+    <w:p>
+      <w:r>
+        <w:t>My phone vibrated. Sarah. 'Jack, we have a problem. The FBI just got a warrant. They're moving in ten minutes. You need to decide now.'</w:t>
+      </w:r>
+    </w:p>
+    <w:p>
+      <w:r>
+        <w:t>I studied the evidence spread before me. The choice wasn't just about method. It was about survival. The system was closing in. Every second counted. I could hear sirens in the distance. Getting closer.</w:t>
+      </w:r>
+    </w:p>
+    <w:p>
+      <w:r>
+        <w:t>'They're five minutes out, Jack,' Sarah's voice was urgent. 'What do you want to do?'</w:t>
+      </w:r>
+    </w:p>
+    <w:p>
+      <w:r>
+        <w:t>The phone rang. Martinez. 'Halloway, we know where you are. We're sending a team. You have fifteen minutes to surrender or we're coming in hot.'</w:t>
+      </w:r>
+    </w:p>
+    <w:p>
+      <w:r>
+        <w:t>I looked around. The evidence was here. The choice was here. But the law was closing in. I could hear helicopters in the distance. The net was tightening.</w:t>
+      </w:r>
+    </w:p>
+    <w:p>
+      <w:r>
+        <w:t>'Jack, we need to move,' Sarah said. Her hand was on her weapon. 'Now.'</w:t>
       </w:r>
     </w:p>
     <w:p>
@@ -1227,198 +1249,190 @@
         </w:rPr>
       </w:pPr>
       <w:r>
+        <w:t>You exposed Margaret Jack? Pathetic. Now Margaret's safety is forfeit. Meet me at the Lamplight Gallery. Bring the letter. I have a clean legal defense for you both. I can protect her from the Overseer's hit squad.. E.C.</w:t>
+      </w:r>
+    </w:p>
+    <w:p>
+      <w:pPr>
+        <w:pBdr>
+          <w:top w:space="0" w:sz="0" w:val="nil"/>
+          <w:left w:space="0" w:sz="0" w:val="nil"/>
+          <w:bottom w:space="0" w:sz="0" w:val="nil"/>
+          <w:right w:space="0" w:sz="0" w:val="nil"/>
+          <w:between w:space="0" w:sz="0" w:val="nil"/>
+        </w:pBdr>
+        <w:shd w:fill="auto" w:val="clear"/>
+        <w:rPr/>
+      </w:pPr>
+      <w:r>
+        <w:t>I studied Margaret. She was pale but held the letter tightly. "She is right Jack. The law can't protect us from men like that. We go to Victoria. She is the only one with the resources to make the hit squad disappear."</w:t>
+      </w:r>
+    </w:p>
+    <w:p>
+      <w:pPr>
+        <w:pBdr>
+          <w:top w:space="0" w:sz="0" w:val="nil"/>
+          <w:left w:space="0" w:sz="0" w:val="nil"/>
+          <w:bottom w:space="0" w:sz="0" w:val="nil"/>
+          <w:right w:space="0" w:sz="0" w:val="nil"/>
+          <w:between w:space="0" w:sz="0" w:val="nil"/>
+        </w:pBdr>
+        <w:shd w:fill="auto" w:val="clear"/>
+        <w:spacing w:after="240" w:lineRule="auto"/>
+        <w:rPr/>
+      </w:pPr>
+      <w:r>
+        <w:rPr>
+          <w:rtl w:val="0"/>
+        </w:rPr>
+        <w:t xml:space="preserve">The gravity of the choice pressed down. Victoria demanded a meeting. Promising legal salvation for Margaret. But her salvation always came with a price.</w:t>
+      </w:r>
+    </w:p>
+    <w:p>
+      <w:pPr>
+        <w:pStyle w:val="Heading3"/>
+        <w:pBdr>
+          <w:top w:space="0" w:sz="0" w:val="nil"/>
+          <w:left w:space="0" w:sz="0" w:val="nil"/>
+          <w:bottom w:space="0" w:sz="0" w:val="nil"/>
+          <w:right w:space="0" w:sz="0" w:val="nil"/>
+          <w:between w:space="0" w:sz="0" w:val="nil"/>
+        </w:pBdr>
+        <w:shd w:fill="auto" w:val="clear"/>
+        <w:spacing w:before="0" w:lineRule="auto"/>
+        <w:rPr/>
+      </w:pPr>
+      <w:r>
+        <w:rPr>
+          <w:rtl w:val="0"/>
+        </w:rPr>
+        <w:t xml:space="preserve">Subchapter 7.3MLEM - The Price of Salvation</w:t>
+      </w:r>
+    </w:p>
+    <w:p>
+      <w:pPr>
+        <w:pBdr>
+          <w:top w:space="0" w:sz="0" w:val="nil"/>
+          <w:left w:space="0" w:sz="0" w:val="nil"/>
+          <w:bottom w:space="0" w:sz="0" w:val="nil"/>
+          <w:right w:space="0" w:sz="0" w:val="nil"/>
+          <w:between w:space="0" w:sz="0" w:val="nil"/>
+        </w:pBdr>
+        <w:shd w:fill="auto" w:val="clear"/>
+        <w:rPr/>
+      </w:pPr>
+      <w:r>
+        <w:rPr>
+          <w:b w:val="1"/>
+          <w:bCs w:val="1"/>
+          <w:rtl w:val="0"/>
+        </w:rPr>
+        <w:t xml:space="preserve">PREVIOUSLY:</w:t>
+      </w:r>
+      <w:r>
+        <w:rPr>
+          <w:rtl w:val="0"/>
+        </w:rPr>
+        <w:t xml:space="preserve"> Jack and Margaret meet Victoria. A deal is offered.</w:t>
+      </w:r>
+    </w:p>
+    <w:p>
+      <w:pPr>
+        <w:pBdr>
+          <w:top w:space="0" w:sz="0" w:val="nil"/>
+          <w:left w:space="0" w:sz="0" w:val="nil"/>
+          <w:bottom w:space="0" w:sz="0" w:val="nil"/>
+          <w:right w:space="0" w:sz="0" w:val="nil"/>
+          <w:between w:space="0" w:sz="0" w:val="nil"/>
+        </w:pBdr>
+        <w:shd w:fill="auto" w:val="clear"/>
+        <w:rPr/>
+      </w:pPr>
+      <w:r>
+        <w:rPr>
+          <w:b w:val="1"/>
+          <w:bCs w:val="1"/>
+          <w:rtl w:val="0"/>
+        </w:rPr>
+        <w:t xml:space="preserve">BRIDGE TEXT:</w:t>
+      </w:r>
+      <w:r>
+        <w:rPr>
+          <w:rtl w:val="0"/>
+        </w:rPr>
+        <w:t xml:space="preserve"> The Gallery is a courtroom. Two documents. One sacrifice.</w:t>
+      </w:r>
+    </w:p>
+    <w:p>
+      <w:pPr>
+        <w:pBdr>
+          <w:top w:space="0" w:sz="0" w:val="nil"/>
+          <w:left w:space="0" w:sz="0" w:val="nil"/>
+          <w:bottom w:space="0" w:sz="0" w:val="nil"/>
+          <w:right w:space="0" w:sz="0" w:val="nil"/>
+          <w:between w:space="0" w:sz="0" w:val="nil"/>
+        </w:pBdr>
+        <w:shd w:fill="auto" w:val="clear"/>
+        <w:rPr/>
+      </w:pPr>
+      <w:r>
+        <w:rPr>
+          <w:b w:val="1"/>
+          <w:bCs w:val="1"/>
+          <w:rtl w:val="0"/>
+        </w:rPr>
+        <w:t xml:space="preserve">NARRATIVE: </w:t>
+      </w:r>
+      <w:r>
+        <w:rPr>
+          <w:rtl w:val="0"/>
+        </w:rPr>
+        <w:t xml:space="preserve">We met Victoria at the Lamplight Gallery. She was waiting. Flanked by two large silent men. Her expression was cold and unforgiving.</w:t>
+      </w:r>
+    </w:p>
+    <w:p>
+      <w:pPr>
+        <w:pBdr>
+          <w:top w:space="0" w:sz="0" w:val="nil"/>
+          <w:left w:space="0" w:sz="0" w:val="nil"/>
+          <w:bottom w:space="0" w:sz="0" w:val="nil"/>
+          <w:right w:space="0" w:sz="0" w:val="nil"/>
+          <w:between w:space="0" w:sz="0" w:val="nil"/>
+        </w:pBdr>
+        <w:shd w:fill="auto" w:val="clear"/>
+        <w:rPr/>
+      </w:pPr>
+      <w:r>
+        <w:rPr>
+          <w:rtl w:val="0"/>
+        </w:rPr>
+        <w:t xml:space="preserve">"You exposed Margaret Jack," she stated. Her voice was devoid of emotion. "Now you pay the price of your negligence."</w:t>
+      </w:r>
+    </w:p>
+    <w:p>
+      <w:pPr>
+        <w:pBdr>
+          <w:top w:space="0" w:sz="0" w:val="nil"/>
+          <w:left w:space="0" w:sz="0" w:val="nil"/>
+          <w:bottom w:space="0" w:sz="0" w:val="nil"/>
+          <w:right w:space="0" w:sz="0" w:val="nil"/>
+          <w:between w:space="0" w:sz="0" w:val="nil"/>
+        </w:pBdr>
+        <w:shd w:fill="auto" w:val="clear"/>
+        <w:rPr/>
+      </w:pPr>
+      <w:r>
+        <w:rPr>
+          <w:rtl w:val="0"/>
+        </w:rPr>
+        <w:t xml:space="preserve">She laid out two documents on a pedestal. A fully prepared legal defense for Margaret proving coercion. And a full signed confession detailing how Margaret was the one who </w:t>
+      </w:r>
+      <w:r>
         <w:rPr>
           <w:i w:val="1"/>
           <w:iCs w:val="1"/>
           <w:rtl w:val="0"/>
         </w:rPr>
-        <w:t xml:space="preserve">You exposed Margaret Jack? Pathetic. Now Margaret's safety is forfeit. Meet me at the Lamplight Gallery. Bring the letter. I have a clean legal defense for you both. I can protect her from the Overseer's hit squad. —E.C.</w:t>
-      </w:r>
-    </w:p>
-    <w:p>
-      <w:pPr>
-        <w:pBdr>
-          <w:top w:space="0" w:sz="0" w:val="nil"/>
-          <w:left w:space="0" w:sz="0" w:val="nil"/>
-          <w:bottom w:space="0" w:sz="0" w:val="nil"/>
-          <w:right w:space="0" w:sz="0" w:val="nil"/>
-          <w:between w:space="0" w:sz="0" w:val="nil"/>
-        </w:pBdr>
-        <w:shd w:fill="auto" w:val="clear"/>
-        <w:rPr/>
-      </w:pPr>
-      <w:r>
-        <w:rPr>
-          <w:rtl w:val="0"/>
-        </w:rPr>
-        <w:t xml:space="preserve">I looked at Margaret. She was pale but held the letter tightly. "She is right Jack. The law can't protect us from men like that. We go to Victoria. She is the only one with the resources to make the hit squad disappear."</w:t>
-      </w:r>
-    </w:p>
-    <w:p>
-      <w:pPr>
-        <w:pBdr>
-          <w:top w:space="0" w:sz="0" w:val="nil"/>
-          <w:left w:space="0" w:sz="0" w:val="nil"/>
-          <w:bottom w:space="0" w:sz="0" w:val="nil"/>
-          <w:right w:space="0" w:sz="0" w:val="nil"/>
-          <w:between w:space="0" w:sz="0" w:val="nil"/>
-        </w:pBdr>
-        <w:shd w:fill="auto" w:val="clear"/>
-        <w:spacing w:after="240" w:lineRule="auto"/>
-        <w:rPr/>
-      </w:pPr>
-      <w:r>
-        <w:rPr>
-          <w:rtl w:val="0"/>
-        </w:rPr>
-        <w:t xml:space="preserve">The gravity of the choice pressed down. Victoria demanded a meeting. Promising legal salvation for Margaret. But her salvation always came with a price.</w:t>
-      </w:r>
-    </w:p>
-    <w:p>
-      <w:pPr>
-        <w:pStyle w:val="Heading3"/>
-        <w:pBdr>
-          <w:top w:space="0" w:sz="0" w:val="nil"/>
-          <w:left w:space="0" w:sz="0" w:val="nil"/>
-          <w:bottom w:space="0" w:sz="0" w:val="nil"/>
-          <w:right w:space="0" w:sz="0" w:val="nil"/>
-          <w:between w:space="0" w:sz="0" w:val="nil"/>
-        </w:pBdr>
-        <w:shd w:fill="auto" w:val="clear"/>
-        <w:spacing w:before="0" w:lineRule="auto"/>
-        <w:rPr/>
-      </w:pPr>
-      <w:r>
-        <w:rPr>
-          <w:rtl w:val="0"/>
-        </w:rPr>
-        <w:t xml:space="preserve">Subchapter 7.3MLEM - The Price of Salvation</w:t>
-      </w:r>
-    </w:p>
-    <w:p>
-      <w:pPr>
-        <w:pBdr>
-          <w:top w:space="0" w:sz="0" w:val="nil"/>
-          <w:left w:space="0" w:sz="0" w:val="nil"/>
-          <w:bottom w:space="0" w:sz="0" w:val="nil"/>
-          <w:right w:space="0" w:sz="0" w:val="nil"/>
-          <w:between w:space="0" w:sz="0" w:val="nil"/>
-        </w:pBdr>
-        <w:shd w:fill="auto" w:val="clear"/>
-        <w:rPr/>
-      </w:pPr>
-      <w:r>
-        <w:rPr>
-          <w:b w:val="1"/>
-          <w:bCs w:val="1"/>
-          <w:rtl w:val="0"/>
-        </w:rPr>
-        <w:t xml:space="preserve">PREVIOUSLY:</w:t>
-      </w:r>
-      <w:r>
-        <w:rPr>
-          <w:rtl w:val="0"/>
-        </w:rPr>
-        <w:t xml:space="preserve"> Jack and Margaret meet Victoria. A deal is offered.</w:t>
-      </w:r>
-    </w:p>
-    <w:p>
-      <w:pPr>
-        <w:pBdr>
-          <w:top w:space="0" w:sz="0" w:val="nil"/>
-          <w:left w:space="0" w:sz="0" w:val="nil"/>
-          <w:bottom w:space="0" w:sz="0" w:val="nil"/>
-          <w:right w:space="0" w:sz="0" w:val="nil"/>
-          <w:between w:space="0" w:sz="0" w:val="nil"/>
-        </w:pBdr>
-        <w:shd w:fill="auto" w:val="clear"/>
-        <w:rPr/>
-      </w:pPr>
-      <w:r>
-        <w:rPr>
-          <w:b w:val="1"/>
-          <w:bCs w:val="1"/>
-          <w:rtl w:val="0"/>
-        </w:rPr>
-        <w:t xml:space="preserve">BRIDGE TEXT:</w:t>
-      </w:r>
-      <w:r>
-        <w:rPr>
-          <w:rtl w:val="0"/>
-        </w:rPr>
-        <w:t xml:space="preserve"> The Gallery is a courtroom. Two documents. One sacrifice.</w:t>
-      </w:r>
-    </w:p>
-    <w:p>
-      <w:pPr>
-        <w:pBdr>
-          <w:top w:space="0" w:sz="0" w:val="nil"/>
-          <w:left w:space="0" w:sz="0" w:val="nil"/>
-          <w:bottom w:space="0" w:sz="0" w:val="nil"/>
-          <w:right w:space="0" w:sz="0" w:val="nil"/>
-          <w:between w:space="0" w:sz="0" w:val="nil"/>
-        </w:pBdr>
-        <w:shd w:fill="auto" w:val="clear"/>
-        <w:rPr/>
-      </w:pPr>
-      <w:r>
-        <w:rPr>
-          <w:b w:val="1"/>
-          <w:bCs w:val="1"/>
-          <w:rtl w:val="0"/>
-        </w:rPr>
-        <w:t xml:space="preserve">NARRATIVE: </w:t>
-      </w:r>
-      <w:r>
-        <w:rPr>
-          <w:rtl w:val="0"/>
-        </w:rPr>
-        <w:t xml:space="preserve">We met Victoria at the Lamplight Gallery. She was waiting. Flanked by two large silent men. Her expression was cold and unforgiving.</w:t>
-      </w:r>
-    </w:p>
-    <w:p>
-      <w:pPr>
-        <w:pBdr>
-          <w:top w:space="0" w:sz="0" w:val="nil"/>
-          <w:left w:space="0" w:sz="0" w:val="nil"/>
-          <w:bottom w:space="0" w:sz="0" w:val="nil"/>
-          <w:right w:space="0" w:sz="0" w:val="nil"/>
-          <w:between w:space="0" w:sz="0" w:val="nil"/>
-        </w:pBdr>
-        <w:shd w:fill="auto" w:val="clear"/>
-        <w:rPr/>
-      </w:pPr>
-      <w:r>
-        <w:rPr>
-          <w:rtl w:val="0"/>
-        </w:rPr>
-        <w:t xml:space="preserve">"You exposed Margaret Jack," she stated. Her voice was devoid of emotion. "Now you pay the price of your negligence."</w:t>
-      </w:r>
-    </w:p>
-    <w:p>
-      <w:pPr>
-        <w:pBdr>
-          <w:top w:space="0" w:sz="0" w:val="nil"/>
-          <w:left w:space="0" w:sz="0" w:val="nil"/>
-          <w:bottom w:space="0" w:sz="0" w:val="nil"/>
-          <w:right w:space="0" w:sz="0" w:val="nil"/>
-          <w:between w:space="0" w:sz="0" w:val="nil"/>
-        </w:pBdr>
-        <w:shd w:fill="auto" w:val="clear"/>
-        <w:rPr/>
-      </w:pPr>
-      <w:r>
-        <w:rPr>
-          <w:rtl w:val="0"/>
-        </w:rPr>
-        <w:t xml:space="preserve">She laid out two documents on a pedestal. A fully prepared legal defense for Margaret proving coercion. And a full signed confession detailing how Margaret was the one who </w:t>
-      </w:r>
-      <w:r>
-        <w:rPr>
-          <w:i w:val="1"/>
-          <w:iCs w:val="1"/>
-          <w:rtl w:val="0"/>
-        </w:rPr>
         <w:t xml:space="preserve">aided</w:t>
       </w:r>
       <w:r>
@@ -1479,10 +1493,22 @@
         <w:rPr/>
       </w:pPr>
       <w:r>
-        <w:rPr>
-          <w:rtl w:val="0"/>
-        </w:rPr>
-        <w:t xml:space="preserve">I looked at Margaret. She was pale but surprisingly firm. She looked at me and nodded slowly. She was willing to pay the price for her part in securing the Overseer's name.</w:t>
+        <w:t>I studied Margaret. She was pale but surprisingly firm. She looked at me and nodded slowly. She was willing to pay the price for her part in securing the Overseer's name.</w:t>
+      </w:r>
+    </w:p>
+    <w:p>
+      <w:r>
+        <w:t>My phone vibrated. Sarah. 'Jack, we have a problem. The FBI just got a warrant. They're moving in ten minutes. You need to decide now.'</w:t>
+      </w:r>
+    </w:p>
+    <w:p>
+      <w:r>
+        <w:t>I studied the evidence spread before me. The choice wasn't just about method. It was about survival. The system was closing in. Every second counted. I could hear sirens in the distance. Getting closer.</w:t>
+      </w:r>
+    </w:p>
+    <w:p>
+      <w:r>
+        <w:t>'They're five minutes out, Jack,' Sarah's voice was urgent. 'What do you want to do?'</w:t>
       </w:r>
     </w:p>
     <w:p>
@@ -1832,50 +1858,273 @@
         </w:rPr>
       </w:pPr>
       <w:r>
+        <w:t>Amateur Detective. You saved Sullivan but you allowed the Grange Ledger to remain hidden. Your clean hands will fail Teresa Wade. Meet me at the Lamplight Gallery. Now. I have the untainted evidence you need but you must earn it.. E.C.</w:t>
+      </w:r>
+    </w:p>
+    <w:p>
+      <w:pPr>
+        <w:pBdr>
+          <w:top w:space="0" w:sz="0" w:val="nil"/>
+          <w:left w:space="0" w:sz="0" w:val="nil"/>
+          <w:bottom w:space="0" w:sz="0" w:val="nil"/>
+          <w:right w:space="0" w:sz="0" w:val="nil"/>
+          <w:between w:space="0" w:sz="0" w:val="nil"/>
+        </w:pBdr>
+        <w:shd w:fill="auto" w:val="clear"/>
+        <w:rPr/>
+      </w:pPr>
+      <w:r>
+        <w:t>The air suddenly felt cold. Victoria hadn't been stalled. She was just observing. She saw my small victory as a large failure. I studied Sarah. I felt the familiar nauseating pull toward the shadows. "She knows we held back the ledger. She wants a confrontation. This is about Teresa."</w:t>
+      </w:r>
+    </w:p>
+    <w:p>
+      <w:pPr>
+        <w:pBdr>
+          <w:top w:space="0" w:sz="0" w:val="nil"/>
+          <w:left w:space="0" w:sz="0" w:val="nil"/>
+          <w:bottom w:space="0" w:sz="0" w:val="nil"/>
+          <w:right w:space="0" w:sz="0" w:val="nil"/>
+          <w:between w:space="0" w:sz="0" w:val="nil"/>
+        </w:pBdr>
+        <w:shd w:fill="auto" w:val="clear"/>
+        <w:rPr/>
+      </w:pPr>
+      <w:r>
+        <w:rPr>
+          <w:rtl w:val="0"/>
+        </w:rPr>
+        <w:t xml:space="preserve">"It's a trap Jack. She wants you back in her orbit," Sarah warned. "Don't go alone. We'll call Martinez."</w:t>
+      </w:r>
+    </w:p>
+    <w:p>
+      <w:pPr>
+        <w:pBdr>
+          <w:top w:space="0" w:sz="0" w:val="nil"/>
+          <w:left w:space="0" w:sz="0" w:val="nil"/>
+          <w:bottom w:space="0" w:sz="0" w:val="nil"/>
+          <w:right w:space="0" w:sz="0" w:val="nil"/>
+          <w:between w:space="0" w:sz="0" w:val="nil"/>
+        </w:pBdr>
+        <w:shd w:fill="auto" w:val="clear"/>
+        <w:spacing w:after="240" w:lineRule="auto"/>
+        <w:rPr/>
+      </w:pPr>
+      <w:r>
+        <w:rPr>
+          <w:rtl w:val="0"/>
+        </w:rPr>
+        <w:t xml:space="preserve">"No. This is personal. She will only talk to me. She is holding Teresa's fate hostage."</w:t>
+      </w:r>
+    </w:p>
+    <w:p>
+      <w:pPr>
+        <w:pStyle w:val="Heading3"/>
+        <w:pBdr>
+          <w:top w:space="0" w:sz="0" w:val="nil"/>
+          <w:left w:space="0" w:sz="0" w:val="nil"/>
+          <w:bottom w:space="0" w:sz="0" w:val="nil"/>
+          <w:right w:space="0" w:sz="0" w:val="nil"/>
+          <w:between w:space="0" w:sz="0" w:val="nil"/>
+        </w:pBdr>
+        <w:shd w:fill="auto" w:val="clear"/>
+        <w:spacing w:before="0" w:lineRule="auto"/>
+        <w:rPr/>
+      </w:pPr>
+      <w:r>
+        <w:rPr>
+          <w:rtl w:val="0"/>
+        </w:rPr>
+        <w:t xml:space="preserve">Subchapter 7.2MLIC - Victoria's Final Gambit</w:t>
+      </w:r>
+    </w:p>
+    <w:p>
+      <w:pPr>
+        <w:pBdr>
+          <w:top w:space="0" w:sz="0" w:val="nil"/>
+          <w:left w:space="0" w:sz="0" w:val="nil"/>
+          <w:bottom w:space="0" w:sz="0" w:val="nil"/>
+          <w:right w:space="0" w:sz="0" w:val="nil"/>
+          <w:between w:space="0" w:sz="0" w:val="nil"/>
+        </w:pBdr>
+        <w:shd w:fill="auto" w:val="clear"/>
+        <w:rPr/>
+      </w:pPr>
+      <w:r>
+        <w:rPr>
+          <w:b w:val="1"/>
+          <w:bCs w:val="1"/>
+          <w:rtl w:val="0"/>
+        </w:rPr>
+        <w:t xml:space="preserve">PREVIOUSLY:</w:t>
+      </w:r>
+      <w:r>
+        <w:rPr>
+          <w:rtl w:val="0"/>
+        </w:rPr>
+        <w:t xml:space="preserve"> Jack meets Victoria. She offers the final piece of the puzzle.</w:t>
+      </w:r>
+    </w:p>
+    <w:p>
+      <w:pPr>
+        <w:pBdr>
+          <w:top w:space="0" w:sz="0" w:val="nil"/>
+          <w:left w:space="0" w:sz="0" w:val="nil"/>
+          <w:bottom w:space="0" w:sz="0" w:val="nil"/>
+          <w:right w:space="0" w:sz="0" w:val="nil"/>
+          <w:between w:space="0" w:sz="0" w:val="nil"/>
+        </w:pBdr>
+        <w:shd w:fill="auto" w:val="clear"/>
+        <w:rPr/>
+      </w:pPr>
+      <w:r>
+        <w:rPr>
+          <w:b w:val="1"/>
+          <w:bCs w:val="1"/>
+          <w:rtl w:val="0"/>
+        </w:rPr>
+        <w:t xml:space="preserve">BRIDGE TEXT:</w:t>
+      </w:r>
+      <w:r>
+        <w:rPr>
+          <w:rtl w:val="0"/>
+        </w:rPr>
+        <w:t xml:space="preserve"> The Gallery is empty. A single notebook. A new victim is targeted.</w:t>
+      </w:r>
+    </w:p>
+    <w:p>
+      <w:pPr>
+        <w:pBdr>
+          <w:top w:space="0" w:sz="0" w:val="nil"/>
+          <w:left w:space="0" w:sz="0" w:val="nil"/>
+          <w:bottom w:space="0" w:sz="0" w:val="nil"/>
+          <w:right w:space="0" w:sz="0" w:val="nil"/>
+          <w:between w:space="0" w:sz="0" w:val="nil"/>
+        </w:pBdr>
+        <w:shd w:fill="auto" w:val="clear"/>
+        <w:rPr/>
+      </w:pPr>
+      <w:r>
+        <w:rPr>
+          <w:b w:val="1"/>
+          <w:bCs w:val="1"/>
+          <w:rtl w:val="0"/>
+        </w:rPr>
+        <w:t xml:space="preserve">NARRATIVE: </w:t>
+      </w:r>
+      <w:r>
+        <w:rPr>
+          <w:rtl w:val="0"/>
+        </w:rPr>
+        <w:t xml:space="preserve">I went to the Lamplight Gallery alone. It was entirely empty. Stripped of the "Perfect Evidence" exhibition. Leaving only sterile white walls and echoing silence. Victoria stood in the center. Impeccably dressed in a charcoal suit. Looking like a CEO observing a hostile acquisition.</w:t>
+      </w:r>
+    </w:p>
+    <w:p>
+      <w:pPr>
+        <w:pBdr>
+          <w:top w:space="0" w:sz="0" w:val="nil"/>
+          <w:left w:space="0" w:sz="0" w:val="nil"/>
+          <w:bottom w:space="0" w:sz="0" w:val="nil"/>
+          <w:right w:space="0" w:sz="0" w:val="nil"/>
+          <w:between w:space="0" w:sz="0" w:val="nil"/>
+        </w:pBdr>
+        <w:shd w:fill="auto" w:val="clear"/>
+        <w:rPr/>
+      </w:pPr>
+      <w:r>
+        <w:rPr>
+          <w:rtl w:val="0"/>
+        </w:rPr>
+        <w:t xml:space="preserve">"The clean path," she scoffed. The word vibrated with contempt. "You traded the full destruction of the corrupt system for a clean legal victory. You protected the institution Jack. Just like you did seven years ago when you sealed my fate."</w:t>
+      </w:r>
+    </w:p>
+    <w:p>
+      <w:pPr>
+        <w:pBdr>
+          <w:top w:space="0" w:sz="0" w:val="nil"/>
+          <w:left w:space="0" w:sz="0" w:val="nil"/>
+          <w:bottom w:space="0" w:sz="0" w:val="nil"/>
+          <w:right w:space="0" w:sz="0" w:val="nil"/>
+          <w:between w:space="0" w:sz="0" w:val="nil"/>
+        </w:pBdr>
+        <w:shd w:fill="auto" w:val="clear"/>
+        <w:rPr/>
+      </w:pPr>
+      <w:r>
+        <w:rPr>
+          <w:rtl w:val="0"/>
+        </w:rPr>
+        <w:t xml:space="preserve">She produced a small leather-bound notebook. </w:t>
+      </w:r>
+      <w:r>
         <w:rPr>
           <w:i w:val="1"/>
           <w:iCs w:val="1"/>
           <w:rtl w:val="0"/>
         </w:rPr>
-        <w:t xml:space="preserve">Amateur Detective. You saved Sullivan but you allowed the Grange Ledger to remain hidden. Your clean hands will fail Teresa Wade. Meet me at the Lamplight Gallery. Now. I have the untainted evidence you need but you must earn it. —E.C.</w:t>
-      </w:r>
-    </w:p>
-    <w:p>
-      <w:pPr>
-        <w:pBdr>
-          <w:top w:space="0" w:sz="0" w:val="nil"/>
-          <w:left w:space="0" w:sz="0" w:val="nil"/>
-          <w:bottom w:space="0" w:sz="0" w:val="nil"/>
-          <w:right w:space="0" w:sz="0" w:val="nil"/>
-          <w:between w:space="0" w:sz="0" w:val="nil"/>
-        </w:pBdr>
-        <w:shd w:fill="auto" w:val="clear"/>
-        <w:rPr/>
-      </w:pPr>
-      <w:r>
-        <w:rPr>
-          <w:rtl w:val="0"/>
-        </w:rPr>
-        <w:t xml:space="preserve">The air suddenly felt cold. Victoria hadn't been stalled. She was just observing. She saw my small victory as a large failure. I looked at Sarah. I felt the familiar nauseating pull toward the shadows. "She knows we held back the ledger. She wants a confrontation. This is about Teresa."</w:t>
-      </w:r>
-    </w:p>
-    <w:p>
-      <w:pPr>
-        <w:pBdr>
-          <w:top w:space="0" w:sz="0" w:val="nil"/>
-          <w:left w:space="0" w:sz="0" w:val="nil"/>
-          <w:bottom w:space="0" w:sz="0" w:val="nil"/>
-          <w:right w:space="0" w:sz="0" w:val="nil"/>
-          <w:between w:space="0" w:sz="0" w:val="nil"/>
-        </w:pBdr>
-        <w:shd w:fill="auto" w:val="clear"/>
-        <w:rPr/>
-      </w:pPr>
-      <w:r>
-        <w:rPr>
-          <w:rtl w:val="0"/>
-        </w:rPr>
-        <w:t xml:space="preserve">"It's a trap Jack. She wants you back in her orbit," Sarah warned. "Don't go alone. We'll call Martinez."</w:t>
+        <w:t xml:space="preserve">The Grange Ledger</w:t>
+      </w:r>
+      <w:r>
+        <w:rPr>
+          <w:rtl w:val="0"/>
+        </w:rPr>
+        <w:t xml:space="preserve">. "This is the true untainted final proof for Teresa Wade. It guarantees her freedom by explicitly detailing Tom's method for manufacturing the accelerant residue. It bypasses any legal challenge the DA can mount."</w:t>
+      </w:r>
+    </w:p>
+    <w:p>
+      <w:pPr>
+        <w:pBdr>
+          <w:top w:space="0" w:sz="0" w:val="nil"/>
+          <w:left w:space="0" w:sz="0" w:val="nil"/>
+          <w:bottom w:space="0" w:sz="0" w:val="nil"/>
+          <w:right w:space="0" w:sz="0" w:val="nil"/>
+          <w:between w:space="0" w:sz="0" w:val="nil"/>
+        </w:pBdr>
+        <w:shd w:fill="auto" w:val="clear"/>
+        <w:rPr/>
+      </w:pPr>
+      <w:r>
+        <w:rPr>
+          <w:rtl w:val="0"/>
+        </w:rPr>
+        <w:t xml:space="preserve">"Give it to me Emily."</w:t>
+      </w:r>
+    </w:p>
+    <w:p>
+      <w:pPr>
+        <w:pBdr>
+          <w:top w:space="0" w:sz="0" w:val="nil"/>
+          <w:left w:space="0" w:sz="0" w:val="nil"/>
+          <w:bottom w:space="0" w:sz="0" w:val="nil"/>
+          <w:right w:space="0" w:sz="0" w:val="nil"/>
+          <w:between w:space="0" w:sz="0" w:val="nil"/>
+        </w:pBdr>
+        <w:shd w:fill="auto" w:val="clear"/>
+        <w:rPr/>
+      </w:pPr>
+      <w:r>
+        <w:rPr>
+          <w:rtl w:val="0"/>
+        </w:rPr>
+        <w:t xml:space="preserve">"No. You must prove you have truly changed. This ledger details the final blackmail target of Grange's operation. Judge Arthur Chen. The presiding judge over Eleanor Bellamy's original trial. He is about to be arrested on falsified evidence by the remaining corrupt elements of the FBI. They are trying to protect the Overseer." Victoria paced. Outlining the trap like a meticulous crime scene. "Judge Chen is a clean man Jack. He refused the blackmail years ago. Now they are destroying him to tie up loose ends."</w:t>
+      </w:r>
+    </w:p>
+    <w:p>
+      <w:pPr>
+        <w:pBdr>
+          <w:top w:space="0" w:sz="0" w:val="nil"/>
+          <w:left w:space="0" w:sz="0" w:val="nil"/>
+          <w:bottom w:space="0" w:sz="0" w:val="nil"/>
+          <w:right w:space="0" w:sz="0" w:val="nil"/>
+          <w:between w:space="0" w:sz="0" w:val="nil"/>
+        </w:pBdr>
+        <w:shd w:fill="auto" w:val="clear"/>
+        <w:rPr/>
+      </w:pPr>
+      <w:r>
+        <w:rPr>
+          <w:rtl w:val="0"/>
+        </w:rPr>
+        <w:t xml:space="preserve">"You want me to save him?"</w:t>
       </w:r>
     </w:p>
     <w:p>
@@ -1895,147 +2144,7 @@
         <w:rPr>
           <w:rtl w:val="0"/>
         </w:rPr>
-        <w:t xml:space="preserve">"No. This is personal. She will only talk to me. She is holding Teresa's fate hostage."</w:t>
-      </w:r>
-    </w:p>
-    <w:p>
-      <w:pPr>
-        <w:pStyle w:val="Heading3"/>
-        <w:pBdr>
-          <w:top w:space="0" w:sz="0" w:val="nil"/>
-          <w:left w:space="0" w:sz="0" w:val="nil"/>
-          <w:bottom w:space="0" w:sz="0" w:val="nil"/>
-          <w:right w:space="0" w:sz="0" w:val="nil"/>
-          <w:between w:space="0" w:sz="0" w:val="nil"/>
-        </w:pBdr>
-        <w:shd w:fill="auto" w:val="clear"/>
-        <w:spacing w:before="0" w:lineRule="auto"/>
-        <w:rPr/>
-      </w:pPr>
-      <w:r>
-        <w:rPr>
-          <w:rtl w:val="0"/>
-        </w:rPr>
-        <w:t xml:space="preserve">Subchapter 7.2MLIC - Victoria's Final Gambit</w:t>
-      </w:r>
-    </w:p>
-    <w:p>
-      <w:pPr>
-        <w:pBdr>
-          <w:top w:space="0" w:sz="0" w:val="nil"/>
-          <w:left w:space="0" w:sz="0" w:val="nil"/>
-          <w:bottom w:space="0" w:sz="0" w:val="nil"/>
-          <w:right w:space="0" w:sz="0" w:val="nil"/>
-          <w:between w:space="0" w:sz="0" w:val="nil"/>
-        </w:pBdr>
-        <w:shd w:fill="auto" w:val="clear"/>
-        <w:rPr/>
-      </w:pPr>
-      <w:r>
-        <w:rPr>
-          <w:b w:val="1"/>
-          <w:bCs w:val="1"/>
-          <w:rtl w:val="0"/>
-        </w:rPr>
-        <w:t xml:space="preserve">PREVIOUSLY:</w:t>
-      </w:r>
-      <w:r>
-        <w:rPr>
-          <w:rtl w:val="0"/>
-        </w:rPr>
-        <w:t xml:space="preserve"> Jack meets Victoria. She offers the final piece of the puzzle.</w:t>
-      </w:r>
-    </w:p>
-    <w:p>
-      <w:pPr>
-        <w:pBdr>
-          <w:top w:space="0" w:sz="0" w:val="nil"/>
-          <w:left w:space="0" w:sz="0" w:val="nil"/>
-          <w:bottom w:space="0" w:sz="0" w:val="nil"/>
-          <w:right w:space="0" w:sz="0" w:val="nil"/>
-          <w:between w:space="0" w:sz="0" w:val="nil"/>
-        </w:pBdr>
-        <w:shd w:fill="auto" w:val="clear"/>
-        <w:rPr/>
-      </w:pPr>
-      <w:r>
-        <w:rPr>
-          <w:b w:val="1"/>
-          <w:bCs w:val="1"/>
-          <w:rtl w:val="0"/>
-        </w:rPr>
-        <w:t xml:space="preserve">BRIDGE TEXT:</w:t>
-      </w:r>
-      <w:r>
-        <w:rPr>
-          <w:rtl w:val="0"/>
-        </w:rPr>
-        <w:t xml:space="preserve"> The Gallery is empty. A single notebook. A new victim is targeted.</w:t>
-      </w:r>
-    </w:p>
-    <w:p>
-      <w:pPr>
-        <w:pBdr>
-          <w:top w:space="0" w:sz="0" w:val="nil"/>
-          <w:left w:space="0" w:sz="0" w:val="nil"/>
-          <w:bottom w:space="0" w:sz="0" w:val="nil"/>
-          <w:right w:space="0" w:sz="0" w:val="nil"/>
-          <w:between w:space="0" w:sz="0" w:val="nil"/>
-        </w:pBdr>
-        <w:shd w:fill="auto" w:val="clear"/>
-        <w:rPr/>
-      </w:pPr>
-      <w:r>
-        <w:rPr>
-          <w:b w:val="1"/>
-          <w:bCs w:val="1"/>
-          <w:rtl w:val="0"/>
-        </w:rPr>
-        <w:t xml:space="preserve">NARRATIVE: </w:t>
-      </w:r>
-      <w:r>
-        <w:rPr>
-          <w:rtl w:val="0"/>
-        </w:rPr>
-        <w:t xml:space="preserve">I went to the Lamplight Gallery alone. It was entirely empty. Stripped of the "Perfect Evidence" exhibition. Leaving only sterile white walls and echoing silence. Victoria stood in the center. Impeccably dressed in a charcoal suit. Looking like a CEO observing a hostile acquisition.</w:t>
-      </w:r>
-    </w:p>
-    <w:p>
-      <w:pPr>
-        <w:pBdr>
-          <w:top w:space="0" w:sz="0" w:val="nil"/>
-          <w:left w:space="0" w:sz="0" w:val="nil"/>
-          <w:bottom w:space="0" w:sz="0" w:val="nil"/>
-          <w:right w:space="0" w:sz="0" w:val="nil"/>
-          <w:between w:space="0" w:sz="0" w:val="nil"/>
-        </w:pBdr>
-        <w:shd w:fill="auto" w:val="clear"/>
-        <w:rPr/>
-      </w:pPr>
-      <w:r>
-        <w:rPr>
-          <w:rtl w:val="0"/>
-        </w:rPr>
-        <w:t xml:space="preserve">"The clean path," she scoffed. The word vibrated with contempt. "You traded the full destruction of the corrupt system for a clean legal victory. You protected the institution Jack. Just like you did seven years ago when you sealed my fate."</w:t>
-      </w:r>
-    </w:p>
-    <w:p>
-      <w:pPr>
-        <w:pBdr>
-          <w:top w:space="0" w:sz="0" w:val="nil"/>
-          <w:left w:space="0" w:sz="0" w:val="nil"/>
-          <w:bottom w:space="0" w:sz="0" w:val="nil"/>
-          <w:right w:space="0" w:sz="0" w:val="nil"/>
-          <w:between w:space="0" w:sz="0" w:val="nil"/>
-        </w:pBdr>
-        <w:shd w:fill="auto" w:val="clear"/>
-        <w:rPr/>
-      </w:pPr>
-      <w:r>
-        <w:rPr>
-          <w:rtl w:val="0"/>
-        </w:rPr>
-        <w:t xml:space="preserve">She produced a small leather-bound notebook. </w:t>
+        <w:t xml:space="preserve">"Yes. You must contact the FBI and leak the falsified arrest warrant to the press before it can be served. You save Judge Chen. Preventing a gross injustice. But you expose the corruption remaining </w:t>
       </w:r>
       <w:r>
         <w:rPr>
@@ -2043,90 +2152,207 @@
           <w:iCs w:val="1"/>
           <w:rtl w:val="0"/>
         </w:rPr>
-        <w:t xml:space="preserve">The Grange Ledger</w:t>
-      </w:r>
-      <w:r>
-        <w:rPr>
-          <w:rtl w:val="0"/>
-        </w:rPr>
-        <w:t xml:space="preserve">. "This is the true untainted final proof for Teresa Wade. It guarantees her freedom by explicitly detailing Tom's method for manufacturing the accelerant residue. It bypasses any legal challenge the DA can mount."</w:t>
-      </w:r>
-    </w:p>
-    <w:p>
-      <w:pPr>
-        <w:pBdr>
-          <w:top w:space="0" w:sz="0" w:val="nil"/>
-          <w:left w:space="0" w:sz="0" w:val="nil"/>
-          <w:bottom w:space="0" w:sz="0" w:val="nil"/>
-          <w:right w:space="0" w:sz="0" w:val="nil"/>
-          <w:between w:space="0" w:sz="0" w:val="nil"/>
-        </w:pBdr>
-        <w:shd w:fill="auto" w:val="clear"/>
-        <w:rPr/>
-      </w:pPr>
-      <w:r>
-        <w:rPr>
-          <w:rtl w:val="0"/>
-        </w:rPr>
-        <w:t xml:space="preserve">"Give it to me Emily."</w:t>
-      </w:r>
-    </w:p>
-    <w:p>
-      <w:pPr>
-        <w:pBdr>
-          <w:top w:space="0" w:sz="0" w:val="nil"/>
-          <w:left w:space="0" w:sz="0" w:val="nil"/>
-          <w:bottom w:space="0" w:sz="0" w:val="nil"/>
-          <w:right w:space="0" w:sz="0" w:val="nil"/>
-          <w:between w:space="0" w:sz="0" w:val="nil"/>
-        </w:pBdr>
-        <w:shd w:fill="auto" w:val="clear"/>
-        <w:rPr/>
-      </w:pPr>
-      <w:r>
-        <w:rPr>
-          <w:rtl w:val="0"/>
-        </w:rPr>
-        <w:t xml:space="preserve">"No. You must prove you have truly changed. This ledger details the final blackmail target of Grange's operation. Judge Arthur Chen. The presiding judge over Eleanor Bellamy's original trial. He is about to be arrested on falsified evidence by the remaining corrupt elements of the FBI. They are trying to protect the Overseer." Victoria paced. Outlining the trap like a meticulous crime scene. "Judge Chen is a clean man Jack. He refused the blackmail years ago. Now they are destroying him to tie up loose ends."</w:t>
-      </w:r>
-    </w:p>
-    <w:p>
-      <w:pPr>
-        <w:pBdr>
-          <w:top w:space="0" w:sz="0" w:val="nil"/>
-          <w:left w:space="0" w:sz="0" w:val="nil"/>
-          <w:bottom w:space="0" w:sz="0" w:val="nil"/>
-          <w:right w:space="0" w:sz="0" w:val="nil"/>
-          <w:between w:space="0" w:sz="0" w:val="nil"/>
-        </w:pBdr>
-        <w:shd w:fill="auto" w:val="clear"/>
-        <w:rPr/>
-      </w:pPr>
-      <w:r>
-        <w:rPr>
-          <w:rtl w:val="0"/>
-        </w:rPr>
-        <w:t xml:space="preserve">"You want me to save him?"</w:t>
-      </w:r>
-    </w:p>
-    <w:p>
-      <w:pPr>
-        <w:pBdr>
-          <w:top w:space="0" w:sz="0" w:val="nil"/>
-          <w:left w:space="0" w:sz="0" w:val="nil"/>
-          <w:bottom w:space="0" w:sz="0" w:val="nil"/>
-          <w:right w:space="0" w:sz="0" w:val="nil"/>
-          <w:between w:space="0" w:sz="0" w:val="nil"/>
-        </w:pBdr>
-        <w:shd w:fill="auto" w:val="clear"/>
-        <w:spacing w:after="240" w:lineRule="auto"/>
-        <w:rPr/>
-      </w:pPr>
-      <w:r>
-        <w:rPr>
-          <w:rtl w:val="0"/>
-        </w:rPr>
-        <w:t xml:space="preserve">"Yes. You must contact the FBI and leak the falsified arrest warrant to the press before it can be served. You save Judge Chen. Preventing a gross injustice. But you expose the corruption remaining </w:t>
+        <w:t xml:space="preserve">within</w:t>
+      </w:r>
+      <w:r>
+        <w:rPr>
+          <w:rtl w:val="0"/>
+        </w:rPr>
+        <w:t xml:space="preserve"> the FBI and compromise the clean legitimate investigation Martinez is running." Victoria leaned in. Her perfume was a suffocating cloud. "It is a necessary sin. It will taint your clean victory forever but it prevents an innocent man from being destroyed by the system he served."</w:t>
+      </w:r>
+    </w:p>
+    <w:p>
+      <w:pPr>
+        <w:pStyle w:val="Heading3"/>
+        <w:pBdr>
+          <w:top w:space="0" w:sz="0" w:val="nil"/>
+          <w:left w:space="0" w:sz="0" w:val="nil"/>
+          <w:bottom w:space="0" w:sz="0" w:val="nil"/>
+          <w:right w:space="0" w:sz="0" w:val="nil"/>
+          <w:between w:space="0" w:sz="0" w:val="nil"/>
+        </w:pBdr>
+        <w:shd w:fill="auto" w:val="clear"/>
+        <w:spacing w:before="0" w:lineRule="auto"/>
+        <w:rPr/>
+      </w:pPr>
+      <w:r>
+        <w:rPr>
+          <w:rtl w:val="0"/>
+        </w:rPr>
+        <w:t xml:space="preserve">Subchapter 7.3MLIC - The Moral Dilemma</w:t>
+      </w:r>
+    </w:p>
+    <w:p>
+      <w:pPr>
+        <w:pBdr>
+          <w:top w:space="0" w:sz="0" w:val="nil"/>
+          <w:left w:space="0" w:sz="0" w:val="nil"/>
+          <w:bottom w:space="0" w:sz="0" w:val="nil"/>
+          <w:right w:space="0" w:sz="0" w:val="nil"/>
+          <w:between w:space="0" w:sz="0" w:val="nil"/>
+        </w:pBdr>
+        <w:shd w:fill="auto" w:val="clear"/>
+        <w:rPr/>
+      </w:pPr>
+      <w:r>
+        <w:rPr>
+          <w:b w:val="1"/>
+          <w:bCs w:val="1"/>
+          <w:rtl w:val="0"/>
+        </w:rPr>
+        <w:t xml:space="preserve">PREVIOUSLY:</w:t>
+      </w:r>
+      <w:r>
+        <w:rPr>
+          <w:rtl w:val="0"/>
+        </w:rPr>
+        <w:t xml:space="preserve"> Victoria demands Jack commit a felony to save a judge and Teresa Wade.</w:t>
+      </w:r>
+    </w:p>
+    <w:p>
+      <w:pPr>
+        <w:pBdr>
+          <w:top w:space="0" w:sz="0" w:val="nil"/>
+          <w:left w:space="0" w:sz="0" w:val="nil"/>
+          <w:bottom w:space="0" w:sz="0" w:val="nil"/>
+          <w:right w:space="0" w:sz="0" w:val="nil"/>
+          <w:between w:space="0" w:sz="0" w:val="nil"/>
+        </w:pBdr>
+        <w:shd w:fill="auto" w:val="clear"/>
+        <w:rPr/>
+      </w:pPr>
+      <w:r>
+        <w:rPr>
+          <w:b w:val="1"/>
+          <w:bCs w:val="1"/>
+          <w:rtl w:val="0"/>
+        </w:rPr>
+        <w:t xml:space="preserve">BRIDGE TEXT:</w:t>
+      </w:r>
+      <w:r>
+        <w:rPr>
+          <w:rtl w:val="0"/>
+        </w:rPr>
+        <w:t xml:space="preserve"> The ledger waits. The phone is in hand. A choice between the law and justice.</w:t>
+      </w:r>
+    </w:p>
+    <w:p>
+      <w:pPr>
+        <w:pBdr>
+          <w:top w:space="0" w:sz="0" w:val="nil"/>
+          <w:left w:space="0" w:sz="0" w:val="nil"/>
+          <w:bottom w:space="0" w:sz="0" w:val="nil"/>
+          <w:right w:space="0" w:sz="0" w:val="nil"/>
+          <w:between w:space="0" w:sz="0" w:val="nil"/>
+        </w:pBdr>
+        <w:shd w:fill="auto" w:val="clear"/>
+        <w:rPr/>
+      </w:pPr>
+      <w:r>
+        <w:rPr>
+          <w:b w:val="1"/>
+          <w:bCs w:val="1"/>
+          <w:rtl w:val="0"/>
+        </w:rPr>
+        <w:t xml:space="preserve">NARRATIVE: </w:t>
+      </w:r>
+      <w:r>
+        <w:rPr>
+          <w:rtl w:val="0"/>
+        </w:rPr>
+        <w:t xml:space="preserve">I stood in the silence of the gallery. The Grange Ledger lay on a pedestal between us like a poisoned chalice. Victoria watched. Waiting for the final failure or the final dark victory.</w:t>
+      </w:r>
+    </w:p>
+    <w:p>
+      <w:pPr>
+        <w:pBdr>
+          <w:top w:space="0" w:sz="0" w:val="nil"/>
+          <w:left w:space="0" w:sz="0" w:val="nil"/>
+          <w:bottom w:space="0" w:sz="0" w:val="nil"/>
+          <w:right w:space="0" w:sz="0" w:val="nil"/>
+          <w:between w:space="0" w:sz="0" w:val="nil"/>
+        </w:pBdr>
+        <w:shd w:fill="auto" w:val="clear"/>
+        <w:rPr/>
+      </w:pPr>
+      <w:r>
+        <w:rPr>
+          <w:rtl w:val="0"/>
+        </w:rPr>
+        <w:t xml:space="preserve">"You are asking me to commit a felony Emily," I stated. The realization solidified in my gut. "I leak that warrant and Martinez will put me away for good. I lose my chance at a clean redemption."</w:t>
+      </w:r>
+    </w:p>
+    <w:p>
+      <w:pPr>
+        <w:pBdr>
+          <w:top w:space="0" w:sz="0" w:val="nil"/>
+          <w:left w:space="0" w:sz="0" w:val="nil"/>
+          <w:bottom w:space="0" w:sz="0" w:val="nil"/>
+          <w:right w:space="0" w:sz="0" w:val="nil"/>
+          <w:between w:space="0" w:sz="0" w:val="nil"/>
+        </w:pBdr>
+        <w:shd w:fill="auto" w:val="clear"/>
+        <w:rPr/>
+      </w:pPr>
+      <w:r>
+        <w:rPr>
+          <w:rtl w:val="0"/>
+        </w:rPr>
+        <w:t xml:space="preserve">"And if you don't," she countered. Her voice sharp. "Judge Chen goes to prison for decades. Teresa remains locked up. You live with the knowledge that your moral purity cost them their freedom. You traded their safety for your conscience. That is the same crime you committed seven years ago."</w:t>
+      </w:r>
+    </w:p>
+    <w:p>
+      <w:pPr>
+        <w:pBdr>
+          <w:top w:space="0" w:sz="0" w:val="nil"/>
+          <w:left w:space="0" w:sz="0" w:val="nil"/>
+          <w:bottom w:space="0" w:sz="0" w:val="nil"/>
+          <w:right w:space="0" w:sz="0" w:val="nil"/>
+          <w:between w:space="0" w:sz="0" w:val="nil"/>
+        </w:pBdr>
+        <w:shd w:fill="auto" w:val="clear"/>
+        <w:rPr/>
+      </w:pPr>
+      <w:r>
+        <w:t>I studied the consequences. Judge Chen. The last vestige of legitimate authority about to be devoured. Teresa. Waiting patiently for a justice that the system would never grant.</w:t>
+      </w:r>
+    </w:p>
+    <w:p>
+      <w:pPr>
+        <w:pBdr>
+          <w:top w:space="0" w:sz="0" w:val="nil"/>
+          <w:left w:space="0" w:sz="0" w:val="nil"/>
+          <w:bottom w:space="0" w:sz="0" w:val="nil"/>
+          <w:right w:space="0" w:sz="0" w:val="nil"/>
+          <w:between w:space="0" w:sz="0" w:val="nil"/>
+        </w:pBdr>
+        <w:shd w:fill="auto" w:val="clear"/>
+        <w:rPr/>
+      </w:pPr>
+      <w:r>
+        <w:rPr>
+          <w:rtl w:val="0"/>
+        </w:rPr>
+        <w:t xml:space="preserve">"I need to know I can trust you," I said. "If I leak the warrant will you ensure the Grange Ledger is legally submitted to Teresa's attorney uncompromised?"</w:t>
+      </w:r>
+    </w:p>
+    <w:p>
+      <w:pPr>
+        <w:pBdr>
+          <w:top w:space="0" w:sz="0" w:val="nil"/>
+          <w:left w:space="0" w:sz="0" w:val="nil"/>
+          <w:bottom w:space="0" w:sz="0" w:val="nil"/>
+          <w:right w:space="0" w:sz="0" w:val="nil"/>
+          <w:between w:space="0" w:sz="0" w:val="nil"/>
+        </w:pBdr>
+        <w:shd w:fill="auto" w:val="clear"/>
+        <w:rPr/>
+      </w:pPr>
+      <w:r>
+        <w:rPr>
+          <w:rtl w:val="0"/>
+        </w:rPr>
+        <w:t xml:space="preserve">"I swear it," Victoria vowed. Her voice low and absolute. "Your integrity will be compromised but the </w:t>
       </w:r>
       <w:r>
         <w:rPr>
@@ -2134,217 +2360,6 @@
           <w:iCs w:val="1"/>
           <w:rtl w:val="0"/>
         </w:rPr>
-        <w:t xml:space="preserve">within</w:t>
-      </w:r>
-      <w:r>
-        <w:rPr>
-          <w:rtl w:val="0"/>
-        </w:rPr>
-        <w:t xml:space="preserve"> the FBI and compromise the clean legitimate investigation Martinez is running." Victoria leaned in. Her perfume was a suffocating cloud. "It is a necessary sin. It will taint your clean victory forever but it prevents an innocent man from being destroyed by the system he served."</w:t>
-      </w:r>
-    </w:p>
-    <w:p>
-      <w:pPr>
-        <w:pStyle w:val="Heading3"/>
-        <w:pBdr>
-          <w:top w:space="0" w:sz="0" w:val="nil"/>
-          <w:left w:space="0" w:sz="0" w:val="nil"/>
-          <w:bottom w:space="0" w:sz="0" w:val="nil"/>
-          <w:right w:space="0" w:sz="0" w:val="nil"/>
-          <w:between w:space="0" w:sz="0" w:val="nil"/>
-        </w:pBdr>
-        <w:shd w:fill="auto" w:val="clear"/>
-        <w:spacing w:before="0" w:lineRule="auto"/>
-        <w:rPr/>
-      </w:pPr>
-      <w:r>
-        <w:rPr>
-          <w:rtl w:val="0"/>
-        </w:rPr>
-        <w:t xml:space="preserve">Subchapter 7.3MLIC - The Moral Dilemma</w:t>
-      </w:r>
-    </w:p>
-    <w:p>
-      <w:pPr>
-        <w:pBdr>
-          <w:top w:space="0" w:sz="0" w:val="nil"/>
-          <w:left w:space="0" w:sz="0" w:val="nil"/>
-          <w:bottom w:space="0" w:sz="0" w:val="nil"/>
-          <w:right w:space="0" w:sz="0" w:val="nil"/>
-          <w:between w:space="0" w:sz="0" w:val="nil"/>
-        </w:pBdr>
-        <w:shd w:fill="auto" w:val="clear"/>
-        <w:rPr/>
-      </w:pPr>
-      <w:r>
-        <w:rPr>
-          <w:b w:val="1"/>
-          <w:bCs w:val="1"/>
-          <w:rtl w:val="0"/>
-        </w:rPr>
-        <w:t xml:space="preserve">PREVIOUSLY:</w:t>
-      </w:r>
-      <w:r>
-        <w:rPr>
-          <w:rtl w:val="0"/>
-        </w:rPr>
-        <w:t xml:space="preserve"> Victoria demands Jack commit a felony to save a judge and Teresa Wade.</w:t>
-      </w:r>
-    </w:p>
-    <w:p>
-      <w:pPr>
-        <w:pBdr>
-          <w:top w:space="0" w:sz="0" w:val="nil"/>
-          <w:left w:space="0" w:sz="0" w:val="nil"/>
-          <w:bottom w:space="0" w:sz="0" w:val="nil"/>
-          <w:right w:space="0" w:sz="0" w:val="nil"/>
-          <w:between w:space="0" w:sz="0" w:val="nil"/>
-        </w:pBdr>
-        <w:shd w:fill="auto" w:val="clear"/>
-        <w:rPr/>
-      </w:pPr>
-      <w:r>
-        <w:rPr>
-          <w:b w:val="1"/>
-          <w:bCs w:val="1"/>
-          <w:rtl w:val="0"/>
-        </w:rPr>
-        <w:t xml:space="preserve">BRIDGE TEXT:</w:t>
-      </w:r>
-      <w:r>
-        <w:rPr>
-          <w:rtl w:val="0"/>
-        </w:rPr>
-        <w:t xml:space="preserve"> The ledger waits. The phone is in hand. A choice between the law and justice.</w:t>
-      </w:r>
-    </w:p>
-    <w:p>
-      <w:pPr>
-        <w:pBdr>
-          <w:top w:space="0" w:sz="0" w:val="nil"/>
-          <w:left w:space="0" w:sz="0" w:val="nil"/>
-          <w:bottom w:space="0" w:sz="0" w:val="nil"/>
-          <w:right w:space="0" w:sz="0" w:val="nil"/>
-          <w:between w:space="0" w:sz="0" w:val="nil"/>
-        </w:pBdr>
-        <w:shd w:fill="auto" w:val="clear"/>
-        <w:rPr/>
-      </w:pPr>
-      <w:r>
-        <w:rPr>
-          <w:b w:val="1"/>
-          <w:bCs w:val="1"/>
-          <w:rtl w:val="0"/>
-        </w:rPr>
-        <w:t xml:space="preserve">NARRATIVE: </w:t>
-      </w:r>
-      <w:r>
-        <w:rPr>
-          <w:rtl w:val="0"/>
-        </w:rPr>
-        <w:t xml:space="preserve">I stood in the silence of the gallery. The Grange Ledger lay on a pedestal between us like a poisoned chalice. Victoria watched. Waiting for the final failure or the final dark victory.</w:t>
-      </w:r>
-    </w:p>
-    <w:p>
-      <w:pPr>
-        <w:pBdr>
-          <w:top w:space="0" w:sz="0" w:val="nil"/>
-          <w:left w:space="0" w:sz="0" w:val="nil"/>
-          <w:bottom w:space="0" w:sz="0" w:val="nil"/>
-          <w:right w:space="0" w:sz="0" w:val="nil"/>
-          <w:between w:space="0" w:sz="0" w:val="nil"/>
-        </w:pBdr>
-        <w:shd w:fill="auto" w:val="clear"/>
-        <w:rPr/>
-      </w:pPr>
-      <w:r>
-        <w:rPr>
-          <w:rtl w:val="0"/>
-        </w:rPr>
-        <w:t xml:space="preserve">"You are asking me to commit a felony Emily," I stated. The realization solidified in my gut. "I leak that warrant and Martinez will put me away for good. I lose my chance at a clean redemption."</w:t>
-      </w:r>
-    </w:p>
-    <w:p>
-      <w:pPr>
-        <w:pBdr>
-          <w:top w:space="0" w:sz="0" w:val="nil"/>
-          <w:left w:space="0" w:sz="0" w:val="nil"/>
-          <w:bottom w:space="0" w:sz="0" w:val="nil"/>
-          <w:right w:space="0" w:sz="0" w:val="nil"/>
-          <w:between w:space="0" w:sz="0" w:val="nil"/>
-        </w:pBdr>
-        <w:shd w:fill="auto" w:val="clear"/>
-        <w:rPr/>
-      </w:pPr>
-      <w:r>
-        <w:rPr>
-          <w:rtl w:val="0"/>
-        </w:rPr>
-        <w:t xml:space="preserve">"And if you don't," she countered. Her voice sharp. "Judge Chen goes to prison for decades. Teresa remains locked up. You live with the knowledge that your moral purity cost them their freedom. You traded their safety for your conscience. That is the same crime you committed seven years ago."</w:t>
-      </w:r>
-    </w:p>
-    <w:p>
-      <w:pPr>
-        <w:pBdr>
-          <w:top w:space="0" w:sz="0" w:val="nil"/>
-          <w:left w:space="0" w:sz="0" w:val="nil"/>
-          <w:bottom w:space="0" w:sz="0" w:val="nil"/>
-          <w:right w:space="0" w:sz="0" w:val="nil"/>
-          <w:between w:space="0" w:sz="0" w:val="nil"/>
-        </w:pBdr>
-        <w:shd w:fill="auto" w:val="clear"/>
-        <w:rPr/>
-      </w:pPr>
-      <w:r>
-        <w:rPr>
-          <w:rtl w:val="0"/>
-        </w:rPr>
-        <w:t xml:space="preserve">I looked at the consequences. Judge Chen. The last vestige of legitimate authority about to be devoured. Teresa. Waiting patiently for a justice that the system would never grant.</w:t>
-      </w:r>
-    </w:p>
-    <w:p>
-      <w:pPr>
-        <w:pBdr>
-          <w:top w:space="0" w:sz="0" w:val="nil"/>
-          <w:left w:space="0" w:sz="0" w:val="nil"/>
-          <w:bottom w:space="0" w:sz="0" w:val="nil"/>
-          <w:right w:space="0" w:sz="0" w:val="nil"/>
-          <w:between w:space="0" w:sz="0" w:val="nil"/>
-        </w:pBdr>
-        <w:shd w:fill="auto" w:val="clear"/>
-        <w:rPr/>
-      </w:pPr>
-      <w:r>
-        <w:rPr>
-          <w:rtl w:val="0"/>
-        </w:rPr>
-        <w:t xml:space="preserve">"I need to know I can trust you," I said. "If I leak the warrant will you ensure the Grange Ledger is legally submitted to Teresa's attorney uncompromised?"</w:t>
-      </w:r>
-    </w:p>
-    <w:p>
-      <w:pPr>
-        <w:pBdr>
-          <w:top w:space="0" w:sz="0" w:val="nil"/>
-          <w:left w:space="0" w:sz="0" w:val="nil"/>
-          <w:bottom w:space="0" w:sz="0" w:val="nil"/>
-          <w:right w:space="0" w:sz="0" w:val="nil"/>
-          <w:between w:space="0" w:sz="0" w:val="nil"/>
-        </w:pBdr>
-        <w:shd w:fill="auto" w:val="clear"/>
-        <w:rPr/>
-      </w:pPr>
-      <w:r>
-        <w:rPr>
-          <w:rtl w:val="0"/>
-        </w:rPr>
-        <w:t xml:space="preserve">"I swear it," Victoria vowed. Her voice low and absolute. "Your integrity will be compromised but the </w:t>
-      </w:r>
-      <w:r>
-        <w:rPr>
-          <w:i w:val="1"/>
-          <w:iCs w:val="1"/>
-          <w:rtl w:val="0"/>
-        </w:rPr>
         <w:t xml:space="preserve">result</w:t>
       </w:r>
       <w:r>
@@ -2352,6 +2367,21 @@
           <w:rtl w:val="0"/>
         </w:rPr>
         <w:t xml:space="preserve"> will be clean. You choose the necessary sin and I will ensure the system does not fail the innocent again."</w:t>
+      </w:r>
+    </w:p>
+    <w:p>
+      <w:r>
+        <w:t>The phone rang. Martinez. 'Halloway, we know where you are. We're sending a team. You have fifteen minutes to surrender or we're coming in hot.'</w:t>
+      </w:r>
+    </w:p>
+    <w:p>
+      <w:r>
+        <w:t>I looked around. The evidence was here. The choice was here. But the law was closing in. I could hear helicopters in the distance. The net was tightening.</w:t>
+      </w:r>
+    </w:p>
+    <w:p>
+      <w:r>
+        <w:t>'Jack, we need to move,' Sarah said. Her hand was on her weapon. 'Now.'</w:t>
       </w:r>
     </w:p>
     <w:p>
@@ -2663,12 +2693,7 @@
         </w:rPr>
       </w:pPr>
       <w:r>
-        <w:rPr>
-          <w:i w:val="1"/>
-          <w:iCs w:val="1"/>
-          <w:rtl w:val="0"/>
-        </w:rPr>
-        <w:t xml:space="preserve">The price of my ledger is protection Detective. You risk going to jail for a decade. Meet me at the Lamplight Gallery. I have a clean legal defense for you. But you must pay my price. And it is a financial one. —E.C.</w:t>
+        <w:t>The price of my ledger is protection Detective. You risk going to jail for a decade. Meet me at the Lamplight Gallery. I have a clean legal defense for you. But you must pay my price. And it is a financial one.. E.C.</w:t>
       </w:r>
     </w:p>
     <w:p>
@@ -3027,6 +3052,36 @@
           <w:rtl w:val="0"/>
         </w:rPr>
         <w:t xml:space="preserve">I had the access codes. The money was Tom's. It was dirty. But it was enough to fund the Teresa Wade defense and keep me out of jail. Victoria's plan was effective if morally repugnant.</w:t>
+      </w:r>
+    </w:p>
+    <w:p>
+      <w:r>
+        <w:t>My phone vibrated. Sarah. 'Jack, we have a problem. The FBI just got a warrant. They're moving in ten minutes. You need to decide now.'</w:t>
+      </w:r>
+    </w:p>
+    <w:p>
+      <w:r>
+        <w:t>I studied the evidence spread before me. The choice wasn't just about method. It was about survival. The system was closing in. Every second counted. I could hear sirens in the distance. Getting closer.</w:t>
+      </w:r>
+    </w:p>
+    <w:p>
+      <w:r>
+        <w:t>'They're five minutes out, Jack,' Sarah's voice was urgent. 'What do you want to do?'</w:t>
+      </w:r>
+    </w:p>
+    <w:p>
+      <w:r>
+        <w:t>My phone lit up. Victoria. 'The evidence room supervisor just received orders to destroy the files. You have two hours before they're incinerated. Your choice, Detective. Do you trust the system or do you trust me?'</w:t>
+      </w:r>
+    </w:p>
+    <w:p>
+      <w:r>
+        <w:t>I studied Sarah. At the evidence. At the clock. Time was running out. The bureaucracy was protecting itself. I had to act now or lose everything.</w:t>
+      </w:r>
+    </w:p>
+    <w:p>
+      <w:r>
+        <w:t>'Jack?' Sarah's voice cut through my thoughts. 'We're out of time. What's your call?'</w:t>
       </w:r>
     </w:p>
     <w:p>

</xml_diff>